<commit_message>
Add prerequisites review, browsable homepage, folder READMEs, HIT letterhead
- prereq/: Mathematics, Python, and ML review pages (sections, checklists,
  self-check questions, refresher links) + index
- Homepage: rationale, expected outcomes, prerequisites CTA, and an Explore
  section linking every folder; Prerequisites added to the top nav
- README.md in every folder (syllabus, labs, references, lessons, notebooks,
  prereq, hit-catalogue, assets, tools) for browsability
- HIT catalogue docs now use the official HIT logo letterhead and brand teal

Co-Authored-By: Claude Opus 4.8 <noreply@anthropic.com>
</commit_message>
<xml_diff>
--- a/hit-catalogue/catalogue_summary.docx
+++ b/hit-catalogue/catalogue_summary.docx
@@ -12,6 +12,7 @@
         <w:rPr>
           <w:rFonts w:ascii="David" w:hAnsi="David" w:cs="David"/>
           <w:b/>
+          <w:color w:val="007881"/>
           <w:sz w:val="28"/>
           <w:rtl/>
         </w:rPr>
@@ -28,6 +29,7 @@
         <w:rPr>
           <w:rFonts w:ascii="David" w:hAnsi="David" w:cs="David"/>
           <w:b/>
+          <w:color w:val="007881"/>
           <w:sz w:val="26"/>
           <w:rtl/>
         </w:rPr>
@@ -152,6 +154,7 @@
         <w:rPr>
           <w:rFonts w:ascii="Times New Roman" w:hAnsi="Times New Roman" w:cs="Times New Roman"/>
           <w:b/>
+          <w:color w:val="007881"/>
           <w:sz w:val="26"/>
         </w:rPr>
         <w:t>Introduction to Deep Learning</w:t>
@@ -223,6 +226,7 @@
       </w:r>
     </w:p>
     <w:sectPr>
+      <w:headerReference w:type="default" r:id="rId9"/>
       <w:pgSz w:w="12240" w:h="15840"/>
       <w:pgMar w:top="1440" w:right="1800" w:bottom="1440" w:left="1800" w:header="720" w:footer="720" w:gutter="0"/>
       <w:cols w:space="720"/>
@@ -230,6 +234,51 @@
     </w:sectPr>
   </w:body>
 </w:document>
+</file>
+
+<file path=word/header1.xml><?xml version="1.0" encoding="utf-8"?>
+<w:hdr xmlns:m="http://schemas.openxmlformats.org/officeDocument/2006/math" xmlns:mc="http://schemas.openxmlformats.org/markup-compatibility/2006" xmlns:mo="http://schemas.microsoft.com/office/mac/office/2008/main" xmlns:mv="urn:schemas-microsoft-com:mac:vml" xmlns:o="urn:schemas-microsoft-com:office:office" xmlns:r="http://schemas.openxmlformats.org/officeDocument/2006/relationships" xmlns:v="urn:schemas-microsoft-com:vml" xmlns:w10="urn:schemas-microsoft-com:office:word" xmlns:w14="http://schemas.microsoft.com/office/word/2010/wordml" xmlns:w="http://schemas.openxmlformats.org/wordprocessingml/2006/main" xmlns:wne="http://schemas.microsoft.com/office/word/2006/wordml" xmlns:wp14="http://schemas.microsoft.com/office/word/2010/wordprocessingDrawing" xmlns:wp="http://schemas.openxmlformats.org/drawingml/2006/wordprocessingDrawing" xmlns:wpc="http://schemas.microsoft.com/office/word/2010/wordprocessingCanvas" xmlns:wpg="http://schemas.microsoft.com/office/word/2010/wordprocessingGroup" xmlns:wpi="http://schemas.microsoft.com/office/word/2010/wordprocessingInk" xmlns:wps="http://schemas.microsoft.com/office/word/2010/wordprocessingShape" mc:Ignorable="w14 wp14">
+  <w:p>
+    <w:pPr>
+      <w:pStyle w:val="Header"/>
+      <w:jc w:val="center"/>
+    </w:pPr>
+    <w:r>
+      <w:drawing>
+        <wp:inline xmlns:a="http://schemas.openxmlformats.org/drawingml/2006/main" xmlns:pic="http://schemas.openxmlformats.org/drawingml/2006/picture">
+          <wp:extent cx="1554480" cy="949178"/>
+          <wp:docPr id="1" name="Picture 1"/>
+          <wp:cNvGraphicFramePr>
+            <a:graphicFrameLocks noChangeAspect="1"/>
+          </wp:cNvGraphicFramePr>
+          <a:graphic>
+            <a:graphicData uri="http://schemas.openxmlformats.org/drawingml/2006/picture">
+              <pic:pic>
+                <pic:nvPicPr>
+                  <pic:cNvPr id="0" name="hit-logo.png"/>
+                  <pic:cNvPicPr/>
+                </pic:nvPicPr>
+                <pic:blipFill>
+                  <a:blip r:embed="rId1"/>
+                  <a:stretch>
+                    <a:fillRect/>
+                  </a:stretch>
+                </pic:blipFill>
+                <pic:spPr>
+                  <a:xfrm>
+                    <a:off x="0" y="0"/>
+                    <a:ext cx="1554480" cy="949178"/>
+                  </a:xfrm>
+                  <a:prstGeom prst="rect"/>
+                </pic:spPr>
+              </pic:pic>
+            </a:graphicData>
+          </a:graphic>
+        </wp:inline>
+      </w:drawing>
+    </w:r>
+  </w:p>
+</w:hdr>
 </file>
 
 <file path=word/numbering.xml><?xml version="1.0" encoding="utf-8"?>

</xml_diff>

<commit_message>
Justified text (HTML + DOCX), HIT package links on homepage, refreshed PDFs
- Homepage: HIT course catalogue package section linking the 4 catalogue docs
  (EN syllabus, HE syllabus, rationale, catalogue summary) for download
- Justified body text in the site CSS and in syllabus.html
- HIT package DOCX now use justified body paragraphs (headings kept aligned)
- Regenerated hit-catalogue DOCX and re-exported syllabus.pdf

Co-Authored-By: Claude Opus 4.8 <noreply@anthropic.com>
</commit_message>
<xml_diff>
--- a/hit-catalogue/catalogue_summary.docx
+++ b/hit-catalogue/catalogue_summary.docx
@@ -54,7 +54,7 @@
       <w:pPr>
         <w:bidi/>
         <w:spacing w:after="0"/>
-        <w:jc w:val="right"/>
+        <w:jc w:val="both"/>
       </w:pPr>
       <w:r>
         <w:rPr>
@@ -70,7 +70,7 @@
       <w:pPr>
         <w:bidi/>
         <w:spacing w:after="0"/>
-        <w:jc w:val="right"/>
+        <w:jc w:val="both"/>
       </w:pPr>
       <w:r>
         <w:rPr>
@@ -86,7 +86,7 @@
       <w:pPr>
         <w:bidi/>
         <w:spacing w:after="0"/>
-        <w:jc w:val="right"/>
+        <w:jc w:val="both"/>
       </w:pPr>
       <w:r>
         <w:rPr>
@@ -102,7 +102,7 @@
       <w:pPr>
         <w:bidi/>
         <w:spacing w:after="160"/>
-        <w:jc w:val="right"/>
+        <w:jc w:val="both"/>
       </w:pPr>
       <w:r>
         <w:rPr>
@@ -118,7 +118,7 @@
       <w:pPr>
         <w:bidi/>
         <w:spacing w:after="120"/>
-        <w:jc w:val="right"/>
+        <w:jc w:val="both"/>
       </w:pPr>
       <w:r>
         <w:rPr>
@@ -134,7 +134,7 @@
       <w:pPr>
         <w:bidi/>
         <w:spacing w:after="240"/>
-        <w:jc w:val="right"/>
+        <w:jc w:val="both"/>
       </w:pPr>
       <w:r>
         <w:rPr>
@@ -163,6 +163,7 @@
     <w:p>
       <w:pPr>
         <w:spacing w:after="0"/>
+        <w:jc w:val="both"/>
       </w:pPr>
       <w:r>
         <w:rPr>
@@ -176,6 +177,7 @@
     <w:p>
       <w:pPr>
         <w:spacing w:after="0"/>
+        <w:jc w:val="both"/>
       </w:pPr>
       <w:r>
         <w:rPr>
@@ -189,6 +191,7 @@
     <w:p>
       <w:pPr>
         <w:spacing w:after="160"/>
+        <w:jc w:val="both"/>
       </w:pPr>
       <w:r>
         <w:rPr>
@@ -202,6 +205,7 @@
     <w:p>
       <w:pPr>
         <w:spacing w:after="120"/>
+        <w:jc w:val="both"/>
       </w:pPr>
       <w:r>
         <w:rPr>
@@ -215,6 +219,7 @@
     <w:p>
       <w:pPr>
         <w:spacing w:after="120"/>
+        <w:jc w:val="both"/>
       </w:pPr>
       <w:r>
         <w:rPr>

</xml_diff>

<commit_message>
Hebrew HIT docs: RTL tables (bidiVisual) and centered titles
- Week-schedule and committee tables now render right-to-left, so the
  Hebrew label/week column sits on the right, matching the HIT template
- Centered the document titles in the Hebrew syllabus, rationale,
  catalogue summary, and committee questionnaire

Co-Authored-By: Claude Opus 4.8 <noreply@anthropic.com>
</commit_message>
<xml_diff>
--- a/hit-catalogue/catalogue_summary.docx
+++ b/hit-catalogue/catalogue_summary.docx
@@ -6,7 +6,7 @@
       <w:pPr>
         <w:bidi/>
         <w:spacing w:after="160"/>
-        <w:jc w:val="right"/>
+        <w:jc w:val="center"/>
       </w:pPr>
       <w:r>
         <w:rPr>
@@ -23,7 +23,7 @@
       <w:pPr>
         <w:bidi/>
         <w:spacing w:after="0"/>
-        <w:jc w:val="right"/>
+        <w:jc w:val="center"/>
       </w:pPr>
       <w:r>
         <w:rPr>
@@ -39,7 +39,7 @@
     <w:p>
       <w:pPr>
         <w:spacing w:after="160"/>
-        <w:jc w:val="right"/>
+        <w:jc w:val="center"/>
       </w:pPr>
       <w:r>
         <w:rPr>

</xml_diff>

<commit_message>
Fully-RTL Hebrew docs, compact objective cards, no direct speech, prereq table
- Hebrew HIT docs: section-level RTL so titles/headings are fully right-to-left;
  English paragraphs forced LTR
- Homepage objective cards redesigned: number + icon + text on one line, compact
- Removed second-person direct speech (you/your) across labs, notebooks, lessons,
  projects, prerequisites, and self-check questions; rephrased to neutral
- "Before you start" is now a readiness table (Subject / topics / Review /
  Self-check) for math, Python, and ML, with clear links to review material and
  self-validation questions
- Added a Self-check link per week in the homepage weekly-materials table, with
  #self-check anchors on lab and prerequisite pages

Co-Authored-By: Claude Opus 4.8 <noreply@anthropic.com>
</commit_message>
<xml_diff>
--- a/hit-catalogue/catalogue_summary.docx
+++ b/hit-catalogue/catalogue_summary.docx
@@ -38,6 +38,7 @@
     </w:p>
     <w:p>
       <w:pPr>
+        <w:bidi w:val="0"/>
         <w:spacing w:after="160"/>
         <w:jc w:val="center"/>
       </w:pPr>
@@ -148,6 +149,7 @@
     </w:p>
     <w:p>
       <w:pPr>
+        <w:bidi w:val="0"/>
         <w:spacing w:after="0"/>
       </w:pPr>
       <w:r>
@@ -162,6 +164,7 @@
     </w:p>
     <w:p>
       <w:pPr>
+        <w:bidi w:val="0"/>
         <w:spacing w:after="0"/>
         <w:jc w:val="both"/>
       </w:pPr>
@@ -176,6 +179,7 @@
     </w:p>
     <w:p>
       <w:pPr>
+        <w:bidi w:val="0"/>
         <w:spacing w:after="0"/>
         <w:jc w:val="both"/>
       </w:pPr>
@@ -190,6 +194,7 @@
     </w:p>
     <w:p>
       <w:pPr>
+        <w:bidi w:val="0"/>
         <w:spacing w:after="160"/>
         <w:jc w:val="both"/>
       </w:pPr>
@@ -204,6 +209,7 @@
     </w:p>
     <w:p>
       <w:pPr>
+        <w:bidi w:val="0"/>
         <w:spacing w:after="120"/>
         <w:jc w:val="both"/>
       </w:pPr>
@@ -218,6 +224,7 @@
     </w:p>
     <w:p>
       <w:pPr>
+        <w:bidi w:val="0"/>
         <w:spacing w:after="120"/>
         <w:jc w:val="both"/>
       </w:pPr>
@@ -235,6 +242,7 @@
       <w:pgSz w:w="12240" w:h="15840"/>
       <w:pgMar w:top="1440" w:right="1800" w:bottom="1440" w:left="1800" w:header="720" w:footer="720" w:gutter="0"/>
       <w:cols w:space="720"/>
+      <w:bidi/>
       <w:docGrid w:linePitch="360"/>
     </w:sectPr>
   </w:body>

</xml_diff>